<commit_message>
Inicio Sprint 2 - Conexión a BD del hosting
</commit_message>
<xml_diff>
--- a/docs/reporte.docx
+++ b/docs/reporte.docx
@@ -1588,6 +1588,7 @@
     <w:p>
       <w:pPr>
         <w:spacing w:line="360" w:lineRule="auto"/>
+        <w:jc w:val="both"/>
       </w:pPr>
       <w:r>
         <w:t>En</w:t>
@@ -1602,6 +1603,7 @@
     <w:p>
       <w:pPr>
         <w:spacing w:line="360" w:lineRule="auto"/>
+        <w:jc w:val="both"/>
       </w:pPr>
       <w:r>
         <w:t xml:space="preserve">La telemedicina surge como una alternativa para acceder a los servicios de salud. </w:t>
@@ -1627,6 +1629,7 @@
     <w:p>
       <w:pPr>
         <w:spacing w:line="360" w:lineRule="auto"/>
+        <w:jc w:val="both"/>
       </w:pPr>
       <w:r>
         <w:t>Para dar respuesta al problema planteado y orientar el desarrollo del prototipo funcional, se establecen los objetivos que guían este proyecto. Estos objetivos permiten definir de manera clara qué se pretende alcanzar, así como las funciones esenciales que deberá cumplir la plataforma de telemedicina durante su operación y demostración.</w:t>
@@ -1635,6 +1638,10 @@
     <w:p>
       <w:pPr>
         <w:spacing w:line="360" w:lineRule="auto"/>
+        <w:jc w:val="both"/>
+        <w:rPr>
+          <w:rStyle w:val="Ttulo3Car"/>
+        </w:rPr>
       </w:pPr>
       <w:r>
         <w:rPr>
@@ -1642,9 +1649,12 @@
         </w:rPr>
         <w:t>2.2.1 Objetivo general</w:t>
       </w:r>
-      <w:r>
-        <w:br/>
-      </w:r>
+    </w:p>
+    <w:p>
+      <w:pPr>
+        <w:spacing w:line="360" w:lineRule="auto"/>
+        <w:jc w:val="both"/>
+      </w:pPr>
       <w:r>
         <w:t>Diseñar y desarrollar</w:t>
       </w:r>
@@ -1762,6 +1772,7 @@
         <w:spacing w:line="360" w:lineRule="auto"/>
       </w:pPr>
       <w:r>
+        <w:lastRenderedPageBreak/>
         <w:t>evolución y archivos adjuntos limitados.</w:t>
       </w:r>
     </w:p>
@@ -1775,7 +1786,6 @@
         <w:spacing w:line="360" w:lineRule="auto"/>
       </w:pPr>
       <w:r>
-        <w:lastRenderedPageBreak/>
         <w:t>Opciones para comunicación sincrónica: chat en vivo y videollamada durante la cita</w:t>
       </w:r>
     </w:p>
@@ -2171,6 +2181,7 @@
     <w:p>
       <w:pPr>
         <w:spacing w:line="360" w:lineRule="auto"/>
+        <w:jc w:val="both"/>
       </w:pPr>
       <w:r>
         <w:t>La práctica de la telemedicina no solo requiere bases legales, sino también el cumplimiento de principios éticos que garanticen la calidad y la seguridad del servicio.</w:t>
@@ -2179,6 +2190,7 @@
     <w:p>
       <w:pPr>
         <w:spacing w:line="360" w:lineRule="auto"/>
+        <w:jc w:val="both"/>
       </w:pPr>
       <w:r>
         <w:t>La Organización Panamericana de la Salud (OPS, 2024) señala que la ética en la salud digital se basa en el respeto a la autonomía del paciente, la justicia en el acceso, la confidencialidad de los datos y la responsabilidad del personal de salud. Esto implica que, aun cuando la atención sea a distancia, el compromiso ético del médico con el bienestar del paciente debe mantenerse intacto.</w:t>
@@ -2187,6 +2199,7 @@
     <w:p>
       <w:pPr>
         <w:spacing w:line="360" w:lineRule="auto"/>
+        <w:jc w:val="both"/>
       </w:pPr>
       <w:r>
         <w:t>Además, la OPS (2024) explica que “la confianza del paciente en las herramientas digitales depende de que se apliquen los mismos estándares éticos que en la atención presencial” (p. 12). Por ello, los profesionales de la salud deben garantizar que la información del paciente sea manejada con respeto, discreción y total transparencia.</w:t>
@@ -2195,6 +2208,7 @@
     <w:p>
       <w:pPr>
         <w:spacing w:line="360" w:lineRule="auto"/>
+        <w:jc w:val="both"/>
       </w:pPr>
       <w:r>
         <w:t>El Centro Nacional de Excelencia Tecnológica en Salud (CENETEC, 2024) recomienda que los proyectos de telesalud incluyan medidas para asegurar la privacidad y promover la equidad, evitando que la falta de acceso a internet o a dispositivos tecnológicos se convierta en una barrera para recibir atención médica.</w:t>
@@ -2203,6 +2217,7 @@
     <w:p>
       <w:pPr>
         <w:spacing w:line="360" w:lineRule="auto"/>
+        <w:jc w:val="both"/>
       </w:pPr>
       <w:r>
         <w:t xml:space="preserve">De igual forma, Saluddigital.io (2024) advierte que en México uno de los retos más importantes es la capacitación ética y técnica del personal médico. Esto es esencial para que el uso de las plataformas </w:t>
@@ -2215,6 +2230,7 @@
     <w:p>
       <w:pPr>
         <w:spacing w:line="360" w:lineRule="auto"/>
+        <w:jc w:val="both"/>
       </w:pPr>
       <w:r>
         <w:t>Las consideraciones éticas muestran que la tecnología no debe reemplazar el trato humano, sino fortalecerlo.</w:t>
@@ -2223,6 +2239,7 @@
     <w:p>
       <w:pPr>
         <w:spacing w:line="360" w:lineRule="auto"/>
+        <w:jc w:val="both"/>
       </w:pPr>
       <w:r>
         <w:t>La confianza, la empatía y el respeto por la privacidad del paciente son elementos fundamentales para que la telemedicina sea no solo funcional, sino también humana.</w:t>
@@ -2231,6 +2248,7 @@
     <w:p>
       <w:pPr>
         <w:spacing w:line="360" w:lineRule="auto"/>
+        <w:jc w:val="both"/>
       </w:pPr>
       <w:r>
         <w:t>Un prototipo de telemedicina que combine seguridad técnica, cumplimiento legal y sensibilidad ética contribuirá de manera real al bienestar de los pacientes y al desarrollo responsable de la salud digital en México.</w:t>
@@ -2581,7 +2599,13 @@
         <w:t>4</w:t>
       </w:r>
       <w:r>
-        <w:t>.3 Roles asignados</w:t>
+        <w:t xml:space="preserve">.3 </w:t>
+      </w:r>
+      <w:r>
+        <w:rPr>
+          <w:highlight w:val="yellow"/>
+        </w:rPr>
+        <w:t>Roles asignados</w:t>
       </w:r>
     </w:p>
     <w:p>
@@ -2782,6 +2806,9 @@
               <w:jc w:val="center"/>
             </w:pPr>
             <w:r>
+              <w:rPr>
+                <w:highlight w:val="yellow"/>
+              </w:rPr>
               <w:t>Scrum Master</w:t>
             </w:r>
           </w:p>
@@ -3029,6 +3056,7 @@
           <w:numId w:val="15"/>
         </w:numPr>
         <w:spacing w:line="360" w:lineRule="auto"/>
+        <w:jc w:val="both"/>
       </w:pPr>
       <w:proofErr w:type="spellStart"/>
       <w:r>
@@ -3047,6 +3075,7 @@
           <w:numId w:val="15"/>
         </w:numPr>
         <w:spacing w:line="360" w:lineRule="auto"/>
+        <w:jc w:val="both"/>
       </w:pPr>
       <w:r>
         <w:t>Sprint Backlog: Define las tareas seleccionadas para cada iteración semanal.</w:t>
@@ -3060,6 +3089,7 @@
           <w:numId w:val="15"/>
         </w:numPr>
         <w:spacing w:line="360" w:lineRule="auto"/>
+        <w:jc w:val="both"/>
       </w:pPr>
       <w:r>
         <w:t>Incremento: Representa la funcionalidad operativa generada al final de cada sprint, lista para revisión y documentación.</w:t>
@@ -3199,6 +3229,7 @@
           <w:numId w:val="15"/>
         </w:numPr>
         <w:spacing w:line="360" w:lineRule="auto"/>
+        <w:jc w:val="both"/>
       </w:pPr>
       <w:r>
         <w:t xml:space="preserve">Visual Studio </w:t>
@@ -3220,6 +3251,7 @@
           <w:numId w:val="15"/>
         </w:numPr>
         <w:spacing w:line="360" w:lineRule="auto"/>
+        <w:jc w:val="both"/>
       </w:pPr>
       <w:r>
         <w:lastRenderedPageBreak/>
@@ -3234,6 +3266,7 @@
           <w:numId w:val="15"/>
         </w:numPr>
         <w:spacing w:line="360" w:lineRule="auto"/>
+        <w:jc w:val="both"/>
       </w:pPr>
       <w:r>
         <w:t xml:space="preserve">Git y GitHub: herramientas para el control de versiones, registro de </w:t>
@@ -3255,6 +3288,7 @@
           <w:numId w:val="15"/>
         </w:numPr>
         <w:spacing w:line="360" w:lineRule="auto"/>
+        <w:jc w:val="both"/>
       </w:pPr>
       <w:r>
         <w:t>Trello: tablero Kanban digital utilizado para planificar y dar seguimiento a las tareas de cada sprint.</w:t>
@@ -3268,6 +3302,7 @@
           <w:numId w:val="15"/>
         </w:numPr>
         <w:spacing w:line="360" w:lineRule="auto"/>
+        <w:jc w:val="both"/>
       </w:pPr>
       <w:r>
         <w:t>CorelDRAW: software empleado para elaborar diagramas UML, de flujo y elementos gráficos del sistema.</w:t>
@@ -3281,86 +3316,23 @@
           <w:numId w:val="15"/>
         </w:numPr>
         <w:spacing w:line="360" w:lineRule="auto"/>
-      </w:pPr>
-      <w:r>
-        <w:t>Microsoft Word: procesador de texto utilizado para la redacción del reporte técnico y la documentación de cada fase del proyecto.</w:t>
-      </w:r>
-    </w:p>
-    <w:p>
-      <w:pPr>
-        <w:pStyle w:val="Prrafodelista"/>
-        <w:spacing w:line="360" w:lineRule="auto"/>
-      </w:pPr>
-    </w:p>
-    <w:p>
-      <w:pPr>
-        <w:pStyle w:val="Ttulo1"/>
-      </w:pPr>
-      <w:r>
-        <w:t xml:space="preserve">CAPÍTULO </w:t>
-      </w:r>
-      <w:r>
-        <w:t>5</w:t>
-      </w:r>
-      <w:r>
-        <w:t xml:space="preserve">. ANÁLISIS </w:t>
-      </w:r>
-      <w:r>
-        <w:t>Y DISEÑO</w:t>
-      </w:r>
-    </w:p>
-    <w:p>
-      <w:pPr>
-        <w:pStyle w:val="Ttulo2"/>
-        <w:spacing w:line="360" w:lineRule="auto"/>
-      </w:pPr>
-      <w:r>
-        <w:t>5</w:t>
-      </w:r>
-      <w:r>
-        <w:t xml:space="preserve">.1 Requerimientos </w:t>
-      </w:r>
-      <w:r>
-        <w:t>del sistema</w:t>
-      </w:r>
-    </w:p>
-    <w:p>
-      <w:pPr>
-        <w:spacing w:line="360" w:lineRule="auto"/>
         <w:jc w:val="both"/>
       </w:pPr>
-      <w:r>
-        <w:t>El presente apartado describe los requerimientos que guían el desarrollo del sistema de telemedicina.</w:t>
-      </w:r>
-    </w:p>
-    <w:p>
-      <w:pPr>
-        <w:spacing w:line="360" w:lineRule="auto"/>
-        <w:jc w:val="both"/>
-      </w:pPr>
-      <w:r>
-        <w:t>Estos requerimientos fueron identificados a partir de las necesidades planteadas en el caso de titulación, las entrevistas con los interesados y el análisis del proceso de atención médica remota.</w:t>
-      </w:r>
-    </w:p>
-    <w:p>
-      <w:pPr>
-        <w:pStyle w:val="Ttulo3"/>
-        <w:spacing w:line="360" w:lineRule="auto"/>
-      </w:pPr>
-      <w:r>
-        <w:t xml:space="preserve">5.1.1 </w:t>
-      </w:r>
-      <w:r>
-        <w:t>Requerimientos funcionales</w:t>
-      </w:r>
-    </w:p>
-    <w:p>
-      <w:pPr>
-        <w:spacing w:line="360" w:lineRule="auto"/>
-        <w:jc w:val="both"/>
-      </w:pPr>
-      <w:r>
-        <w:t>Los requerimientos funcionales representan las funcionalidades principales que el sistema debe cumplir. A continuación, se enlistan los requerimientos que se encuentran directamente relacionados con las Historias de Usuario (HU):</w:t>
+      <w:proofErr w:type="spellStart"/>
+      <w:r>
+        <w:t>MysQl</w:t>
+      </w:r>
+      <w:proofErr w:type="spellEnd"/>
+      <w:r>
+        <w:t xml:space="preserve"> </w:t>
+      </w:r>
+      <w:proofErr w:type="spellStart"/>
+      <w:r>
+        <w:t>Workbench</w:t>
+      </w:r>
+      <w:proofErr w:type="spellEnd"/>
+      <w:r>
+        <w:t xml:space="preserve"> DER</w:t>
       </w:r>
     </w:p>
     <w:p>
@@ -3371,6 +3343,111 @@
           <w:numId w:val="15"/>
         </w:numPr>
         <w:spacing w:line="360" w:lineRule="auto"/>
+        <w:jc w:val="both"/>
+      </w:pPr>
+      <w:r>
+        <w:t>MySQL</w:t>
+      </w:r>
+    </w:p>
+    <w:p>
+      <w:pPr>
+        <w:pStyle w:val="Prrafodelista"/>
+        <w:numPr>
+          <w:ilvl w:val="0"/>
+          <w:numId w:val="15"/>
+        </w:numPr>
+        <w:spacing w:line="360" w:lineRule="auto"/>
+        <w:jc w:val="both"/>
+      </w:pPr>
+      <w:r>
+        <w:t>Microsoft Word: procesador de texto utilizado para la redacción del reporte técnico y la documentación de cada fase del proyecto.</w:t>
+      </w:r>
+    </w:p>
+    <w:p>
+      <w:pPr>
+        <w:pStyle w:val="Prrafodelista"/>
+        <w:spacing w:line="360" w:lineRule="auto"/>
+      </w:pPr>
+    </w:p>
+    <w:p>
+      <w:pPr>
+        <w:pStyle w:val="Ttulo1"/>
+      </w:pPr>
+      <w:r>
+        <w:t xml:space="preserve">CAPÍTULO </w:t>
+      </w:r>
+      <w:r>
+        <w:t>5</w:t>
+      </w:r>
+      <w:r>
+        <w:t xml:space="preserve">. ANÁLISIS </w:t>
+      </w:r>
+      <w:r>
+        <w:t>Y DISEÑO</w:t>
+      </w:r>
+    </w:p>
+    <w:p>
+      <w:pPr>
+        <w:pStyle w:val="Ttulo2"/>
+        <w:spacing w:line="360" w:lineRule="auto"/>
+      </w:pPr>
+      <w:r>
+        <w:t>5</w:t>
+      </w:r>
+      <w:r>
+        <w:t xml:space="preserve">.1 Requerimientos </w:t>
+      </w:r>
+      <w:r>
+        <w:t>del sistema</w:t>
+      </w:r>
+    </w:p>
+    <w:p>
+      <w:pPr>
+        <w:spacing w:line="360" w:lineRule="auto"/>
+        <w:jc w:val="both"/>
+      </w:pPr>
+      <w:r>
+        <w:t>El presente apartado describe los requerimientos que guían el desarrollo del sistema de telemedicina.</w:t>
+      </w:r>
+    </w:p>
+    <w:p>
+      <w:pPr>
+        <w:spacing w:line="360" w:lineRule="auto"/>
+        <w:jc w:val="both"/>
+      </w:pPr>
+      <w:r>
+        <w:t>Estos requerimientos fueron identificados a partir de las necesidades planteadas en el caso de titulación, las entrevistas con los interesados y el análisis del proceso de atención médica remota.</w:t>
+      </w:r>
+    </w:p>
+    <w:p>
+      <w:pPr>
+        <w:pStyle w:val="Ttulo3"/>
+        <w:spacing w:line="360" w:lineRule="auto"/>
+      </w:pPr>
+      <w:r>
+        <w:t xml:space="preserve">5.1.1 </w:t>
+      </w:r>
+      <w:r>
+        <w:t>Requerimientos funcionales</w:t>
+      </w:r>
+    </w:p>
+    <w:p>
+      <w:pPr>
+        <w:spacing w:line="360" w:lineRule="auto"/>
+        <w:jc w:val="both"/>
+      </w:pPr>
+      <w:r>
+        <w:t>Los requerimientos funcionales representan las funcionalidades principales que el sistema debe cumplir. A continuación, se enlistan los requerimientos que se encuentran directamente relacionados con las Historias de Usuario (HU):</w:t>
+      </w:r>
+    </w:p>
+    <w:p>
+      <w:pPr>
+        <w:pStyle w:val="Prrafodelista"/>
+        <w:numPr>
+          <w:ilvl w:val="0"/>
+          <w:numId w:val="15"/>
+        </w:numPr>
+        <w:spacing w:line="360" w:lineRule="auto"/>
       </w:pPr>
       <w:r>
         <w:rPr>
@@ -3498,6 +3575,7 @@
           <w:b/>
           <w:bCs/>
         </w:rPr>
+        <w:lastRenderedPageBreak/>
         <w:t>Historia clínica mínima</w:t>
       </w:r>
       <w:r>
@@ -3518,7 +3596,6 @@
           <w:b/>
           <w:bCs/>
         </w:rPr>
-        <w:lastRenderedPageBreak/>
         <w:t>Opciones para comunicación sincrónica:</w:t>
       </w:r>
       <w:r>
@@ -3599,12 +3676,6 @@
     </w:p>
     <w:p>
       <w:pPr>
-        <w:pStyle w:val="Sinespaciado"/>
-        <w:spacing w:line="360" w:lineRule="auto"/>
-      </w:pPr>
-    </w:p>
-    <w:p>
-      <w:pPr>
         <w:pStyle w:val="Prrafodelista"/>
         <w:numPr>
           <w:ilvl w:val="0"/>
@@ -3815,7 +3886,6 @@
         <w:spacing w:line="360" w:lineRule="auto"/>
       </w:pPr>
       <w:r>
-        <w:lastRenderedPageBreak/>
         <w:t>Compatibilidad: el sistema debe ser accesible desde computadoras y dispositivos móviles.</w:t>
       </w:r>
     </w:p>
@@ -3829,6 +3899,7 @@
         <w:spacing w:line="360" w:lineRule="auto"/>
       </w:pPr>
       <w:r>
+        <w:lastRenderedPageBreak/>
         <w:t>Escalabilidad: debe ser posible agregar nuevos servicios médicos sin rediseñar la estructura.</w:t>
       </w:r>
     </w:p>
@@ -3877,7 +3948,13 @@
         <w:spacing w:line="360" w:lineRule="auto"/>
       </w:pPr>
       <w:r>
-        <w:t>5.2.1 Historias de Usuario Oficiales</w:t>
+        <w:t xml:space="preserve">5.2.1 Historias de Usuario </w:t>
+      </w:r>
+      <w:r>
+        <w:rPr>
+          <w:highlight w:val="yellow"/>
+        </w:rPr>
+        <w:t>Oficiales</w:t>
       </w:r>
     </w:p>
     <w:p>
@@ -6085,25 +6162,7 @@
           <w:i/>
           <w:iCs/>
         </w:rPr>
-        <w:t xml:space="preserve">Tabla </w:t>
-      </w:r>
-      <w:r>
-        <w:rPr>
-          <w:b/>
-          <w:bCs/>
-          <w:i/>
-          <w:iCs/>
-        </w:rPr>
-        <w:t>5.</w:t>
-      </w:r>
-      <w:r>
-        <w:rPr>
-          <w:b/>
-          <w:bCs/>
-          <w:i/>
-          <w:iCs/>
-        </w:rPr>
-        <w:t>2. Historias de Usuario complementarias</w:t>
+        <w:t>Tabla 5.2. Historias de Usuario complementarias</w:t>
       </w:r>
     </w:p>
     <w:p>
@@ -6643,15 +6702,7 @@
               <w:cnfStyle w:val="000000100000" w:firstRow="0" w:lastRow="0" w:firstColumn="0" w:lastColumn="0" w:oddVBand="0" w:evenVBand="0" w:oddHBand="1" w:evenHBand="0" w:firstRowFirstColumn="0" w:firstRowLastColumn="0" w:lastRowFirstColumn="0" w:lastRowLastColumn="0"/>
             </w:pPr>
             <w:r>
-              <w:t xml:space="preserve">• </w:t>
-            </w:r>
-            <w:proofErr w:type="gramStart"/>
-            <w:r>
-              <w:t>1:N</w:t>
-            </w:r>
-            <w:proofErr w:type="gramEnd"/>
-            <w:r>
-              <w:t xml:space="preserve"> con </w:t>
+              <w:t xml:space="preserve">• 1:N con </w:t>
             </w:r>
             <w:proofErr w:type="spellStart"/>
             <w:r>
@@ -6728,15 +6779,7 @@
               <w:cnfStyle w:val="000000000000" w:firstRow="0" w:lastRow="0" w:firstColumn="0" w:lastColumn="0" w:oddVBand="0" w:evenVBand="0" w:oddHBand="0" w:evenHBand="0" w:firstRowFirstColumn="0" w:firstRowLastColumn="0" w:lastRowFirstColumn="0" w:lastRowLastColumn="0"/>
             </w:pPr>
             <w:r>
-              <w:t xml:space="preserve">• </w:t>
-            </w:r>
-            <w:proofErr w:type="gramStart"/>
-            <w:r>
-              <w:t>1:N</w:t>
-            </w:r>
-            <w:proofErr w:type="gramEnd"/>
-            <w:r>
-              <w:t xml:space="preserve"> con Cita y Consentimiento</w:t>
+              <w:t>• 1:N con Cita y Consentimiento</w:t>
             </w:r>
           </w:p>
         </w:tc>
@@ -6807,15 +6850,7 @@
               <w:cnfStyle w:val="000000100000" w:firstRow="0" w:lastRow="0" w:firstColumn="0" w:lastColumn="0" w:oddVBand="0" w:evenVBand="0" w:oddHBand="1" w:evenHBand="0" w:firstRowFirstColumn="0" w:firstRowLastColumn="0" w:lastRowFirstColumn="0" w:lastRowLastColumn="0"/>
             </w:pPr>
             <w:r>
-              <w:t xml:space="preserve">• </w:t>
-            </w:r>
-            <w:proofErr w:type="gramStart"/>
-            <w:r>
-              <w:t>1:N</w:t>
-            </w:r>
-            <w:proofErr w:type="gramEnd"/>
-            <w:r>
-              <w:t xml:space="preserve"> con Disponibilidad y Cita</w:t>
+              <w:t>• 1:N con Disponibilidad y Cita</w:t>
             </w:r>
           </w:p>
         </w:tc>
@@ -6850,15 +6885,7 @@
               <w:cnfStyle w:val="000000000000" w:firstRow="0" w:lastRow="0" w:firstColumn="0" w:lastColumn="0" w:oddVBand="0" w:evenVBand="0" w:oddHBand="0" w:evenHBand="0" w:firstRowFirstColumn="0" w:firstRowLastColumn="0" w:lastRowFirstColumn="0" w:lastRowLastColumn="0"/>
             </w:pPr>
             <w:r>
-              <w:t xml:space="preserve">Bloques de tiempo que </w:t>
-            </w:r>
-            <w:proofErr w:type="gramStart"/>
-            <w:r>
-              <w:t>el médico habilita</w:t>
-            </w:r>
-            <w:proofErr w:type="gramEnd"/>
-            <w:r>
-              <w:t xml:space="preserve"> para citas.</w:t>
+              <w:t>Bloques de tiempo que el médico habilita para citas.</w:t>
             </w:r>
           </w:p>
         </w:tc>
@@ -6952,15 +6979,7 @@
               <w:cnfStyle w:val="000000100000" w:firstRow="0" w:lastRow="0" w:firstColumn="0" w:lastColumn="0" w:oddVBand="0" w:evenVBand="0" w:oddHBand="1" w:evenHBand="0" w:firstRowFirstColumn="0" w:firstRowLastColumn="0" w:lastRowFirstColumn="0" w:lastRowLastColumn="0"/>
             </w:pPr>
             <w:r>
-              <w:t xml:space="preserve">• </w:t>
-            </w:r>
-            <w:proofErr w:type="gramStart"/>
-            <w:r>
-              <w:t>1:N</w:t>
-            </w:r>
-            <w:proofErr w:type="gramEnd"/>
-            <w:r>
-              <w:t xml:space="preserve"> con </w:t>
+              <w:t xml:space="preserve">• 1:N con </w:t>
             </w:r>
             <w:proofErr w:type="spellStart"/>
             <w:r>
@@ -7144,15 +7163,7 @@
               <w:cnfStyle w:val="000000000000" w:firstRow="0" w:lastRow="0" w:firstColumn="0" w:lastColumn="0" w:oddVBand="0" w:evenVBand="0" w:oddHBand="0" w:evenHBand="0" w:firstRowFirstColumn="0" w:firstRowLastColumn="0" w:lastRowFirstColumn="0" w:lastRowLastColumn="0"/>
             </w:pPr>
             <w:r>
-              <w:t xml:space="preserve">• </w:t>
-            </w:r>
-            <w:proofErr w:type="gramStart"/>
-            <w:r>
-              <w:t>1:N</w:t>
-            </w:r>
-            <w:proofErr w:type="gramEnd"/>
-            <w:r>
-              <w:t xml:space="preserve"> con Adjunto</w:t>
+              <w:t>• 1:N con Adjunto</w:t>
             </w:r>
           </w:p>
         </w:tc>
@@ -7700,11 +7711,9 @@
               <w:jc w:val="center"/>
               <w:cnfStyle w:val="000000100000" w:firstRow="0" w:lastRow="0" w:firstColumn="0" w:lastColumn="0" w:oddVBand="0" w:evenVBand="0" w:oddHBand="1" w:evenHBand="0" w:firstRowFirstColumn="0" w:firstRowLastColumn="0" w:lastRowFirstColumn="0" w:lastRowLastColumn="0"/>
             </w:pPr>
-            <w:proofErr w:type="gramStart"/>
             <w:r>
               <w:t>1:N</w:t>
             </w:r>
-            <w:proofErr w:type="gramEnd"/>
           </w:p>
         </w:tc>
         <w:tc>
@@ -7756,11 +7765,9 @@
               <w:jc w:val="center"/>
               <w:cnfStyle w:val="000000000000" w:firstRow="0" w:lastRow="0" w:firstColumn="0" w:lastColumn="0" w:oddVBand="0" w:evenVBand="0" w:oddHBand="0" w:evenHBand="0" w:firstRowFirstColumn="0" w:firstRowLastColumn="0" w:lastRowFirstColumn="0" w:lastRowLastColumn="0"/>
             </w:pPr>
-            <w:proofErr w:type="gramStart"/>
             <w:r>
               <w:t>1:N</w:t>
             </w:r>
-            <w:proofErr w:type="gramEnd"/>
           </w:p>
         </w:tc>
         <w:tc>
@@ -7817,11 +7824,9 @@
               <w:jc w:val="center"/>
               <w:cnfStyle w:val="000000100000" w:firstRow="0" w:lastRow="0" w:firstColumn="0" w:lastColumn="0" w:oddVBand="0" w:evenVBand="0" w:oddHBand="1" w:evenHBand="0" w:firstRowFirstColumn="0" w:firstRowLastColumn="0" w:lastRowFirstColumn="0" w:lastRowLastColumn="0"/>
             </w:pPr>
-            <w:proofErr w:type="gramStart"/>
             <w:r>
               <w:t>1:N</w:t>
             </w:r>
-            <w:proofErr w:type="gramEnd"/>
           </w:p>
         </w:tc>
         <w:tc>
@@ -7932,11 +7937,9 @@
               <w:jc w:val="center"/>
               <w:cnfStyle w:val="000000100000" w:firstRow="0" w:lastRow="0" w:firstColumn="0" w:lastColumn="0" w:oddVBand="0" w:evenVBand="0" w:oddHBand="1" w:evenHBand="0" w:firstRowFirstColumn="0" w:firstRowLastColumn="0" w:lastRowFirstColumn="0" w:lastRowLastColumn="0"/>
             </w:pPr>
-            <w:proofErr w:type="gramStart"/>
             <w:r>
               <w:t>1:N</w:t>
             </w:r>
-            <w:proofErr w:type="gramEnd"/>
           </w:p>
         </w:tc>
         <w:tc>
@@ -8057,11 +8060,9 @@
               <w:jc w:val="center"/>
               <w:cnfStyle w:val="000000100000" w:firstRow="0" w:lastRow="0" w:firstColumn="0" w:lastColumn="0" w:oddVBand="0" w:evenVBand="0" w:oddHBand="1" w:evenHBand="0" w:firstRowFirstColumn="0" w:firstRowLastColumn="0" w:lastRowFirstColumn="0" w:lastRowLastColumn="0"/>
             </w:pPr>
-            <w:proofErr w:type="gramStart"/>
             <w:r>
               <w:t>1:N</w:t>
             </w:r>
-            <w:proofErr w:type="gramEnd"/>
           </w:p>
         </w:tc>
         <w:tc>
@@ -8118,11 +8119,9 @@
               <w:jc w:val="center"/>
               <w:cnfStyle w:val="000000000000" w:firstRow="0" w:lastRow="0" w:firstColumn="0" w:lastColumn="0" w:oddVBand="0" w:evenVBand="0" w:oddHBand="0" w:evenHBand="0" w:firstRowFirstColumn="0" w:firstRowLastColumn="0" w:lastRowFirstColumn="0" w:lastRowLastColumn="0"/>
             </w:pPr>
-            <w:proofErr w:type="gramStart"/>
             <w:r>
               <w:t>1:N</w:t>
             </w:r>
-            <w:proofErr w:type="gramEnd"/>
           </w:p>
         </w:tc>
         <w:tc>
@@ -8184,11 +8183,9 @@
               <w:jc w:val="center"/>
               <w:cnfStyle w:val="000000100000" w:firstRow="0" w:lastRow="0" w:firstColumn="0" w:lastColumn="0" w:oddVBand="0" w:evenVBand="0" w:oddHBand="1" w:evenHBand="0" w:firstRowFirstColumn="0" w:firstRowLastColumn="0" w:lastRowFirstColumn="0" w:lastRowLastColumn="0"/>
             </w:pPr>
-            <w:proofErr w:type="gramStart"/>
             <w:r>
               <w:t>1:N</w:t>
             </w:r>
-            <w:proofErr w:type="gramEnd"/>
           </w:p>
         </w:tc>
         <w:tc>
@@ -8245,11 +8242,9 @@
               <w:jc w:val="center"/>
               <w:cnfStyle w:val="000000000000" w:firstRow="0" w:lastRow="0" w:firstColumn="0" w:lastColumn="0" w:oddVBand="0" w:evenVBand="0" w:oddHBand="0" w:evenHBand="0" w:firstRowFirstColumn="0" w:firstRowLastColumn="0" w:lastRowFirstColumn="0" w:lastRowLastColumn="0"/>
             </w:pPr>
-            <w:proofErr w:type="gramStart"/>
             <w:r>
               <w:t>1:N</w:t>
             </w:r>
-            <w:proofErr w:type="gramEnd"/>
           </w:p>
         </w:tc>
         <w:tc>
@@ -8382,9 +8377,24 @@
     </w:p>
     <w:p>
       <w:pPr>
+        <w:rPr>
+          <w:rFonts w:eastAsiaTheme="majorEastAsia" w:cstheme="majorBidi"/>
+          <w:b/>
+          <w:color w:val="611232"/>
+          <w:sz w:val="28"/>
+          <w:szCs w:val="40"/>
+        </w:rPr>
+      </w:pPr>
+      <w:r>
+        <w:br w:type="page"/>
+      </w:r>
+    </w:p>
+    <w:p>
+      <w:pPr>
         <w:pStyle w:val="Ttulo1"/>
       </w:pPr>
       <w:r>
+        <w:lastRenderedPageBreak/>
         <w:t>10. REFERENCIAS</w:t>
       </w:r>
     </w:p>
@@ -8453,6 +8463,182 @@
         <w:spacing w:line="360" w:lineRule="auto"/>
       </w:pPr>
       <w:r>
+        <w:t>Centro Nacional de Excelencia Tecnológica en Salud [CENETEC]. (2024). Boletín de Telesalud 15 (May-</w:t>
+      </w:r>
+      <w:proofErr w:type="spellStart"/>
+      <w:r>
+        <w:t>Ago</w:t>
+      </w:r>
+      <w:proofErr w:type="spellEnd"/>
+      <w:r>
+        <w:t xml:space="preserve"> 2024). https://cenetec-difusion.com/observatoriotelesalud/wp-content/uploads/2024/09/Boletin-en-Telesalud-15_May-Ago-2024.pdf</w:t>
+      </w:r>
+    </w:p>
+    <w:p>
+      <w:pPr>
+        <w:spacing w:line="360" w:lineRule="auto"/>
+      </w:pPr>
+      <w:r>
+        <w:t>Instituto Nacional de Transparencia, Acceso a la Información y Protección de Datos Personales [INAI]. (2020). Ley Federal de Protección de Datos Personales en Posesión de los Particulares. Diario Oficial de la Federación. https://www.dof.gob.mx/nota_detalle.php?codigo=5150631</w:t>
+      </w:r>
+    </w:p>
+    <w:p>
+      <w:pPr>
+        <w:spacing w:line="360" w:lineRule="auto"/>
+      </w:pPr>
+      <w:r>
+        <w:t xml:space="preserve">Organización Mundial de la Salud [OMS]. (2010). </w:t>
+      </w:r>
+      <w:proofErr w:type="spellStart"/>
+      <w:r>
+        <w:t>Telemedicine</w:t>
+      </w:r>
+      <w:proofErr w:type="spellEnd"/>
+      <w:r>
+        <w:t xml:space="preserve">: </w:t>
+      </w:r>
+      <w:proofErr w:type="spellStart"/>
+      <w:r>
+        <w:t>Opportunities</w:t>
+      </w:r>
+      <w:proofErr w:type="spellEnd"/>
+      <w:r>
+        <w:t xml:space="preserve"> and </w:t>
+      </w:r>
+      <w:proofErr w:type="spellStart"/>
+      <w:r>
+        <w:t>developments</w:t>
+      </w:r>
+      <w:proofErr w:type="spellEnd"/>
+      <w:r>
+        <w:t xml:space="preserve"> in </w:t>
+      </w:r>
+      <w:proofErr w:type="spellStart"/>
+      <w:r>
+        <w:t>Member</w:t>
+      </w:r>
+      <w:proofErr w:type="spellEnd"/>
+      <w:r>
+        <w:t xml:space="preserve"> </w:t>
+      </w:r>
+      <w:proofErr w:type="spellStart"/>
+      <w:r>
+        <w:t>States</w:t>
+      </w:r>
+      <w:proofErr w:type="spellEnd"/>
+      <w:r>
+        <w:t xml:space="preserve"> (</w:t>
+      </w:r>
+      <w:proofErr w:type="spellStart"/>
+      <w:r>
+        <w:t>Report</w:t>
+      </w:r>
+      <w:proofErr w:type="spellEnd"/>
+      <w:r>
+        <w:t xml:space="preserve"> </w:t>
+      </w:r>
+      <w:proofErr w:type="spellStart"/>
+      <w:r>
+        <w:t>of</w:t>
+      </w:r>
+      <w:proofErr w:type="spellEnd"/>
+      <w:r>
+        <w:t xml:space="preserve"> </w:t>
+      </w:r>
+      <w:proofErr w:type="spellStart"/>
+      <w:r>
+        <w:t>the</w:t>
+      </w:r>
+      <w:proofErr w:type="spellEnd"/>
+      <w:r>
+        <w:t xml:space="preserve"> </w:t>
+      </w:r>
+      <w:proofErr w:type="spellStart"/>
+      <w:r>
+        <w:t>second</w:t>
+      </w:r>
+      <w:proofErr w:type="spellEnd"/>
+      <w:r>
+        <w:t xml:space="preserve"> global </w:t>
+      </w:r>
+      <w:proofErr w:type="spellStart"/>
+      <w:r>
+        <w:t>survey</w:t>
+      </w:r>
+      <w:proofErr w:type="spellEnd"/>
+      <w:r>
+        <w:t xml:space="preserve"> </w:t>
+      </w:r>
+      <w:proofErr w:type="spellStart"/>
+      <w:r>
+        <w:t>on</w:t>
+      </w:r>
+      <w:proofErr w:type="spellEnd"/>
+      <w:r>
+        <w:t xml:space="preserve"> </w:t>
+      </w:r>
+      <w:proofErr w:type="spellStart"/>
+      <w:r>
+        <w:t>eHealth</w:t>
+      </w:r>
+      <w:proofErr w:type="spellEnd"/>
+      <w:r>
+        <w:t>). https://apps.who.int/iris/handle/10665/44497</w:t>
+      </w:r>
+    </w:p>
+    <w:p>
+      <w:pPr>
+        <w:spacing w:line="360" w:lineRule="auto"/>
+      </w:pPr>
+      <w:r>
+        <w:t>Organización Panamericana de la Salud [OPS]. (2024). Salud digital en América Latina: legislación actual y desafíos. https://iris.paho.org/bitstream/handle/10665.2/59521/v48e402024.pdf</w:t>
+      </w:r>
+    </w:p>
+    <w:p>
+      <w:pPr>
+        <w:spacing w:line="360" w:lineRule="auto"/>
+      </w:pPr>
+      <w:r>
+        <w:t>Revista Abogacía. (2025). Telemedicina en México: regulación pendiente para garantizar el derecho a la salud. https://www.revistaabogacia.com/telemedicina-en-mexico-regulacion-pendiente-para-garantizar-el-derecho-a-la-salud</w:t>
+      </w:r>
+    </w:p>
+    <w:p>
+      <w:pPr>
+        <w:spacing w:line="360" w:lineRule="auto"/>
+      </w:pPr>
+      <w:r>
+        <w:t>Saluddigital.io. (2024). Telemedicina en México: barreras y oportunidades. https://www.saluddigital.io/blog/telemedicina-en-m%C3%A9xico-barreras-y-oportunidades</w:t>
+      </w:r>
+    </w:p>
+    <w:p>
+      <w:pPr>
+        <w:spacing w:line="360" w:lineRule="auto"/>
+      </w:pPr>
+      <w:r>
+        <w:t>Secretaría de Salud. (1998). Norma Oficial Mexicana NOM-168-SSA1-1998, del expediente clínico. Diario Oficial de la Federación. https://dof.gob.mx/nota_detalle.php?codigo=4881768&amp;fecha=30/09/1999</w:t>
+      </w:r>
+    </w:p>
+    <w:p>
+      <w:pPr>
+        <w:spacing w:line="360" w:lineRule="auto"/>
+      </w:pPr>
+      <w:r>
+        <w:t>Secretaría de Salud. (2012). Norma Oficial Mexicana NOM-004-SSA3-2012, del expediente clínico. Diario Oficial de la Federación. https://www.dof.gob.mx/normasOficiales/4415/salud/salud.htm</w:t>
+      </w:r>
+    </w:p>
+    <w:p>
+      <w:pPr>
+        <w:spacing w:line="360" w:lineRule="auto"/>
+      </w:pPr>
+      <w:r>
+        <w:t>Secretaría de Salud. (2023). ¿Qué es la telesalud y la telemedicina? https://www.gob.mx/salud/dgmoss/acciones-y-programas/que-es-la-telesalud-y-la-telemedicina</w:t>
+      </w:r>
+    </w:p>
+    <w:p>
+      <w:pPr>
+        <w:spacing w:line="360" w:lineRule="auto"/>
+      </w:pPr>
+      <w:r>
         <w:lastRenderedPageBreak/>
         <w:t>Centro Nacional de Excelencia Tecnológica en Salud [CENETEC]. (2024). Boletín de Telesalud 15 (May-</w:t>
       </w:r>
@@ -8470,118 +8656,6 @@
         <w:spacing w:line="360" w:lineRule="auto"/>
       </w:pPr>
       <w:r>
-        <w:t>Instituto Nacional de Transparencia, Acceso a la Información y Protección de Datos Personales [INAI]. (2020). Ley Federal de Protección de Datos Personales en Posesión de los Particulares. Diario Oficial de la Federación. https://www.dof.gob.mx/nota_detalle.php?codigo=5150631</w:t>
-      </w:r>
-    </w:p>
-    <w:p>
-      <w:pPr>
-        <w:spacing w:line="360" w:lineRule="auto"/>
-      </w:pPr>
-      <w:r>
-        <w:t xml:space="preserve">Organización Mundial de la Salud [OMS]. (2010). </w:t>
-      </w:r>
-      <w:proofErr w:type="spellStart"/>
-      <w:r>
-        <w:t>Telemedicine</w:t>
-      </w:r>
-      <w:proofErr w:type="spellEnd"/>
-      <w:r>
-        <w:t xml:space="preserve">: </w:t>
-      </w:r>
-      <w:proofErr w:type="spellStart"/>
-      <w:r>
-        <w:t>Opportunities</w:t>
-      </w:r>
-      <w:proofErr w:type="spellEnd"/>
-      <w:r>
-        <w:t xml:space="preserve"> and </w:t>
-      </w:r>
-      <w:proofErr w:type="spellStart"/>
-      <w:r>
-        <w:t>developments</w:t>
-      </w:r>
-      <w:proofErr w:type="spellEnd"/>
-      <w:r>
-        <w:t xml:space="preserve"> in </w:t>
-      </w:r>
-      <w:proofErr w:type="spellStart"/>
-      <w:r>
-        <w:t>Member</w:t>
-      </w:r>
-      <w:proofErr w:type="spellEnd"/>
-      <w:r>
-        <w:t xml:space="preserve"> </w:t>
-      </w:r>
-      <w:proofErr w:type="spellStart"/>
-      <w:r>
-        <w:t>States</w:t>
-      </w:r>
-      <w:proofErr w:type="spellEnd"/>
-      <w:r>
-        <w:t xml:space="preserve"> (</w:t>
-      </w:r>
-      <w:proofErr w:type="spellStart"/>
-      <w:r>
-        <w:t>Report</w:t>
-      </w:r>
-      <w:proofErr w:type="spellEnd"/>
-      <w:r>
-        <w:t xml:space="preserve"> </w:t>
-      </w:r>
-      <w:proofErr w:type="spellStart"/>
-      <w:r>
-        <w:t>of</w:t>
-      </w:r>
-      <w:proofErr w:type="spellEnd"/>
-      <w:r>
-        <w:t xml:space="preserve"> </w:t>
-      </w:r>
-      <w:proofErr w:type="spellStart"/>
-      <w:r>
-        <w:t>the</w:t>
-      </w:r>
-      <w:proofErr w:type="spellEnd"/>
-      <w:r>
-        <w:t xml:space="preserve"> </w:t>
-      </w:r>
-      <w:proofErr w:type="spellStart"/>
-      <w:r>
-        <w:t>second</w:t>
-      </w:r>
-      <w:proofErr w:type="spellEnd"/>
-      <w:r>
-        <w:t xml:space="preserve"> global </w:t>
-      </w:r>
-      <w:proofErr w:type="spellStart"/>
-      <w:r>
-        <w:t>survey</w:t>
-      </w:r>
-      <w:proofErr w:type="spellEnd"/>
-      <w:r>
-        <w:t xml:space="preserve"> </w:t>
-      </w:r>
-      <w:proofErr w:type="spellStart"/>
-      <w:r>
-        <w:t>on</w:t>
-      </w:r>
-      <w:proofErr w:type="spellEnd"/>
-      <w:r>
-        <w:t xml:space="preserve"> </w:t>
-      </w:r>
-      <w:proofErr w:type="spellStart"/>
-      <w:r>
-        <w:t>eHealth</w:t>
-      </w:r>
-      <w:proofErr w:type="spellEnd"/>
-      <w:r>
-        <w:t>). https://apps.who.int/iris/handle/10665/44497</w:t>
-      </w:r>
-    </w:p>
-    <w:p>
-      <w:pPr>
-        <w:spacing w:line="360" w:lineRule="auto"/>
-      </w:pPr>
-      <w:r>
         <w:t>Organización Panamericana de la Salud [OPS]. (2024). Salud digital en América Latina: legislación actual y desafíos. https://iris.paho.org/bitstream/handle/10665.2/59521/v48e402024.pdf</w:t>
       </w:r>
     </w:p>
@@ -8590,71 +8664,6 @@
         <w:spacing w:line="360" w:lineRule="auto"/>
       </w:pPr>
       <w:r>
-        <w:t>Revista Abogacía. (2025). Telemedicina en México: regulación pendiente para garantizar el derecho a la salud. https://www.revistaabogacia.com/telemedicina-en-mexico-regulacion-pendiente-para-garantizar-el-derecho-a-la-salud</w:t>
-      </w:r>
-    </w:p>
-    <w:p>
-      <w:pPr>
-        <w:spacing w:line="360" w:lineRule="auto"/>
-      </w:pPr>
-      <w:r>
-        <w:t>Saluddigital.io. (2024). Telemedicina en México: barreras y oportunidades. https://www.saluddigital.io/blog/telemedicina-en-m%C3%A9xico-barreras-y-oportunidades</w:t>
-      </w:r>
-    </w:p>
-    <w:p>
-      <w:pPr>
-        <w:spacing w:line="360" w:lineRule="auto"/>
-      </w:pPr>
-      <w:r>
-        <w:t>Secretaría de Salud. (1998). Norma Oficial Mexicana NOM-168-SSA1-1998, del expediente clínico. Diario Oficial de la Federación. https://dof.gob.mx/nota_detalle.php?codigo=4881768&amp;fecha=30/09/1999</w:t>
-      </w:r>
-    </w:p>
-    <w:p>
-      <w:pPr>
-        <w:spacing w:line="360" w:lineRule="auto"/>
-      </w:pPr>
-      <w:r>
-        <w:t>Secretaría de Salud. (2012). Norma Oficial Mexicana NOM-004-SSA3-2012, del expediente clínico. Diario Oficial de la Federación. https://www.dof.gob.mx/normasOficiales/4415/salud/salud.htm</w:t>
-      </w:r>
-    </w:p>
-    <w:p>
-      <w:pPr>
-        <w:spacing w:line="360" w:lineRule="auto"/>
-      </w:pPr>
-      <w:r>
-        <w:t>Secretaría de Salud. (2023). ¿Qué es la telesalud y la telemedicina? https://www.gob.mx/salud/dgmoss/acciones-y-programas/que-es-la-telesalud-y-la-telemedicina</w:t>
-      </w:r>
-    </w:p>
-    <w:p>
-      <w:pPr>
-        <w:spacing w:line="360" w:lineRule="auto"/>
-      </w:pPr>
-      <w:r>
-        <w:t>Centro Nacional de Excelencia Tecnológica en Salud [CENETEC]. (2024). Boletín de Telesalud 15 (May-</w:t>
-      </w:r>
-      <w:proofErr w:type="spellStart"/>
-      <w:r>
-        <w:t>Ago</w:t>
-      </w:r>
-      <w:proofErr w:type="spellEnd"/>
-      <w:r>
-        <w:t xml:space="preserve"> 2024). https://cenetec-difusion.com/observatoriotelesalud/wp-content/uploads/2024/09/Boletin-en-Telesalud-15_May-Ago-2024.pdf</w:t>
-      </w:r>
-    </w:p>
-    <w:p>
-      <w:pPr>
-        <w:spacing w:line="360" w:lineRule="auto"/>
-      </w:pPr>
-      <w:r>
-        <w:t>Organización Panamericana de la Salud [OPS]. (2024). Salud digital en América Latina: legislación actual y desafíos. https://iris.paho.org/bitstream/handle/10665.2/59521/v48e402024.pdf</w:t>
-      </w:r>
-    </w:p>
-    <w:p>
-      <w:pPr>
-        <w:spacing w:line="360" w:lineRule="auto"/>
-      </w:pPr>
-      <w:r>
-        <w:lastRenderedPageBreak/>
         <w:t>Saluddigital.io. (2024). Telemedicina en México: barreras y oportunidades. https://www.saluddigital.io/blog/telemedicina-en-m%C3%A9xico-barreras-y-oportunidades</w:t>
       </w:r>
     </w:p>
@@ -10085,7 +10094,7 @@
       <w:lvlText w:val=""/>
       <w:lvlJc w:val="left"/>
       <w:pPr>
-        <w:ind w:left="720" w:hanging="360"/>
+        <w:ind w:left="644" w:hanging="360"/>
       </w:pPr>
       <w:rPr>
         <w:rFonts w:ascii="Wingdings" w:hAnsi="Wingdings" w:hint="default"/>
@@ -12747,6 +12756,7 @@
   <w:style w:type="character" w:default="1" w:styleId="Fuentedeprrafopredeter">
     <w:name w:val="Default Paragraph Font"/>
     <w:uiPriority w:val="1"/>
+    <w:semiHidden/>
     <w:unhideWhenUsed/>
   </w:style>
   <w:style w:type="table" w:default="1" w:styleId="Tablanormal">

</xml_diff>

<commit_message>
Implementación de Historia Clínica + Sala de Consulta + Perfil + Documentación
</commit_message>
<xml_diff>
--- a/docs/reporte.docx
+++ b/docs/reporte.docx
@@ -19773,12 +19773,7 @@
         <w:pStyle w:val="codigo"/>
       </w:pPr>
       <w:r>
-        <w:t xml:space="preserve">    INSERT INTO consentimiento (idConsentimie</w:t>
-      </w:r>
-      <w:bookmarkStart w:id="3" w:name="_GoBack"/>
-      <w:bookmarkEnd w:id="3"/>
-      <w:r>
-        <w:t>nto, idPaciente, versionTexto, fechaAceptacion, ipAceptacion)</w:t>
+        <w:t xml:space="preserve">    INSERT INTO consentimiento (idConsentimiento, idPaciente, versionTexto, fechaAceptacion, ipAceptacion)</w:t>
       </w:r>
     </w:p>
     <w:p>
@@ -20470,6 +20465,14 @@
       <w:r>
         <w:t>.</w:t>
       </w:r>
+      <w:r>
+        <w:br/>
+      </w:r>
+      <w:r>
+        <w:br/>
+      </w:r>
+      <w:bookmarkStart w:id="3" w:name="_GoBack"/>
+      <w:bookmarkEnd w:id="3"/>
     </w:p>
     <w:bookmarkEnd w:id="2"/>
     <w:p>
@@ -20557,12 +20560,12 @@
     </w:p>
     <w:p>
       <w:r>
+        <w:lastRenderedPageBreak/>
         <w:t>Organización Panamericana de la Salud [OPS]. (2024). Salud digital en América Latina: legislación actual y desafíos.</w:t>
       </w:r>
     </w:p>
     <w:p>
       <w:r>
-        <w:lastRenderedPageBreak/>
         <w:t>https://iris.paho.org/bitstream/handle/10665.2/59521/v48e402024.pdf</w:t>
       </w:r>
     </w:p>

</xml_diff>